<commit_message>
Rebuild Word docx from current brief markdown
Co-Authored-By: Claude Sonnet 4.6 <noreply@anthropic.com>
</commit_message>
<xml_diff>
--- a/uhero_brief_lng_lsfo.docx
+++ b/uhero_brief_lng_lsfo.docx
@@ -2,7 +2,7 @@
 <file path=word/document.xml><?xml version="1.0" encoding="utf-8"?>
 <w:document xmlns:w="http://schemas.openxmlformats.org/wordprocessingml/2006/main" xmlns:m="http://schemas.openxmlformats.org/officeDocument/2006/math" xmlns:r="http://schemas.openxmlformats.org/officeDocument/2006/relationships" xmlns:o="urn:schemas-microsoft-com:office:office" xmlns:v="urn:schemas-microsoft-com:vml" xmlns:w10="urn:schemas-microsoft-com:office:word" xmlns:a="http://schemas.openxmlformats.org/drawingml/2006/main" xmlns:pic="http://schemas.openxmlformats.org/drawingml/2006/picture" xmlns:wp="http://schemas.openxmlformats.org/drawingml/2006/wordprocessingDrawing">
   <w:body>
-    <w:bookmarkStart w:id="69" w:name="X905c501dcc6739850b6203438307e89afd5ad00"/>
+    <w:bookmarkStart w:id="72" w:name="X905c501dcc6739850b6203438307e89afd5ad00"/>
     <w:p>
       <w:pPr>
         <w:pStyle w:val="Heading1"/>
@@ -1753,7 +1753,7 @@
     </w:p>
     <w:bookmarkEnd w:id="39"/>
     <w:bookmarkEnd w:id="40"/>
-    <w:bookmarkStart w:id="42" w:name="X13ea2406194d1413e3310f3705b851ecba90b96"/>
+    <w:bookmarkStart w:id="45" w:name="X13ea2406194d1413e3310f3705b851ecba90b96"/>
     <w:p>
       <w:pPr>
         <w:pStyle w:val="Heading2"/>
@@ -2668,6 +2668,48 @@
       <w:pPr>
         <w:pStyle w:val="BodyText"/>
       </w:pPr>
+      <w:r>
+        <w:drawing>
+          <wp:inline>
+            <wp:extent cx="5334000" cy="6176210"/>
+            <wp:effectExtent b="0" l="0" r="0" t="0"/>
+            <wp:docPr descr="" title="" id="43" name="Picture"/>
+            <a:graphic>
+              <a:graphicData uri="http://schemas.openxmlformats.org/drawingml/2006/picture">
+                <pic:pic>
+                  <pic:nvPicPr>
+                    <pic:cNvPr descr="brief_figures/fig_fuel_cost_twopanel_doc.pdf" id="44" name="Picture"/>
+                    <pic:cNvPicPr>
+                      <a:picLocks noChangeArrowheads="1" noChangeAspect="1"/>
+                    </pic:cNvPicPr>
+                  </pic:nvPicPr>
+                  <pic:blipFill>
+                    <a:blip r:embed="rId42"/>
+                    <a:stretch>
+                      <a:fillRect/>
+                    </a:stretch>
+                  </pic:blipFill>
+                  <pic:spPr bwMode="auto">
+                    <a:xfrm>
+                      <a:off x="0" y="0"/>
+                      <a:ext cx="5334000" cy="6176210"/>
+                    </a:xfrm>
+                    <a:prstGeom prst="rect">
+                      <a:avLst/>
+                    </a:prstGeom>
+                    <a:noFill/>
+                    <a:ln w="9525">
+                      <a:noFill/>
+                      <a:headEnd/>
+                      <a:tailEnd/>
+                    </a:ln>
+                  </pic:spPr>
+                </pic:pic>
+              </a:graphicData>
+            </a:graphic>
+          </wp:inline>
+        </w:drawing>
+      </w:r>
     </w:p>
     <w:p>
       <w:pPr>
@@ -3121,8 +3163,8 @@
         </w:pict>
       </w:r>
     </w:p>
-    <w:bookmarkEnd w:id="42"/>
-    <w:bookmarkStart w:id="43" w:name="Xcc1e464b7dbf28eb8dac6446952dd1826484eb9"/>
+    <w:bookmarkEnd w:id="45"/>
+    <w:bookmarkStart w:id="46" w:name="Xcc1e464b7dbf28eb8dac6446952dd1826484eb9"/>
     <w:p>
       <w:pPr>
         <w:pStyle w:val="Heading2"/>
@@ -3213,8 +3255,8 @@
         </w:pict>
       </w:r>
     </w:p>
-    <w:bookmarkEnd w:id="43"/>
-    <w:bookmarkStart w:id="44" w:name="X2ed73dd46fd510cb4cb44434afdda64ff605de6"/>
+    <w:bookmarkEnd w:id="46"/>
+    <w:bookmarkStart w:id="47" w:name="X2ed73dd46fd510cb4cb44434afdda64ff605de6"/>
     <w:p>
       <w:pPr>
         <w:pStyle w:val="Heading2"/>
@@ -3328,8 +3370,8 @@
         </w:pict>
       </w:r>
     </w:p>
-    <w:bookmarkEnd w:id="44"/>
-    <w:bookmarkStart w:id="45" w:name="conclusions"/>
+    <w:bookmarkEnd w:id="47"/>
+    <w:bookmarkStart w:id="48" w:name="conclusions"/>
     <w:p>
       <w:pPr>
         <w:pStyle w:val="Heading2"/>
@@ -3530,8 +3572,8 @@
         </w:pict>
       </w:r>
     </w:p>
-    <w:bookmarkEnd w:id="45"/>
-    <w:bookmarkStart w:id="53" w:name="glossary"/>
+    <w:bookmarkEnd w:id="48"/>
+    <w:bookmarkStart w:id="56" w:name="glossary"/>
     <w:p>
       <w:pPr>
         <w:pStyle w:val="Heading2"/>
@@ -3540,7 +3582,7 @@
         <w:t xml:space="preserve">Glossary</w:t>
       </w:r>
     </w:p>
-    <w:bookmarkStart w:id="46" w:name="energy-units"/>
+    <w:bookmarkStart w:id="49" w:name="energy-units"/>
     <w:p>
       <w:pPr>
         <w:pStyle w:val="Heading3"/>
@@ -3682,8 +3724,8 @@
         </w:pict>
       </w:r>
     </w:p>
-    <w:bookmarkEnd w:id="46"/>
-    <w:bookmarkStart w:id="47" w:name="crude-oil-and-fuel-grades"/>
+    <w:bookmarkEnd w:id="49"/>
+    <w:bookmarkStart w:id="50" w:name="crude-oil-and-fuel-grades"/>
     <w:p>
       <w:pPr>
         <w:pStyle w:val="Heading3"/>
@@ -3771,8 +3813,8 @@
         </w:pict>
       </w:r>
     </w:p>
-    <w:bookmarkEnd w:id="47"/>
-    <w:bookmarkStart w:id="48" w:name="lng-and-natural-gas"/>
+    <w:bookmarkEnd w:id="50"/>
+    <w:bookmarkStart w:id="51" w:name="lng-and-natural-gas"/>
     <w:p>
       <w:pPr>
         <w:pStyle w:val="Heading3"/>
@@ -3860,8 +3902,8 @@
         </w:pict>
       </w:r>
     </w:p>
-    <w:bookmarkEnd w:id="48"/>
-    <w:bookmarkStart w:id="49" w:name="power-plant-technology"/>
+    <w:bookmarkEnd w:id="51"/>
+    <w:bookmarkStart w:id="52" w:name="power-plant-technology"/>
     <w:p>
       <w:pPr>
         <w:pStyle w:val="Heading3"/>
@@ -3931,8 +3973,8 @@
         </w:pict>
       </w:r>
     </w:p>
-    <w:bookmarkEnd w:id="49"/>
-    <w:bookmarkStart w:id="50" w:name="institutions-and-plans"/>
+    <w:bookmarkEnd w:id="52"/>
+    <w:bookmarkStart w:id="53" w:name="institutions-and-plans"/>
     <w:p>
       <w:pPr>
         <w:pStyle w:val="Heading3"/>
@@ -4070,8 +4112,8 @@
         </w:pict>
       </w:r>
     </w:p>
-    <w:bookmarkEnd w:id="50"/>
-    <w:bookmarkStart w:id="51" w:name="economic-terms"/>
+    <w:bookmarkEnd w:id="53"/>
+    <w:bookmarkStart w:id="54" w:name="economic-terms"/>
     <w:p>
       <w:pPr>
         <w:pStyle w:val="Heading3"/>
@@ -4159,8 +4201,8 @@
         </w:pict>
       </w:r>
     </w:p>
-    <w:bookmarkEnd w:id="51"/>
-    <w:bookmarkStart w:id="52" w:name="unit-conversions"/>
+    <w:bookmarkEnd w:id="54"/>
+    <w:bookmarkStart w:id="55" w:name="unit-conversions"/>
     <w:p>
       <w:pPr>
         <w:pStyle w:val="Heading3"/>
@@ -4588,9 +4630,9 @@
         </w:pict>
       </w:r>
     </w:p>
-    <w:bookmarkEnd w:id="52"/>
-    <w:bookmarkEnd w:id="53"/>
-    <w:bookmarkStart w:id="67" w:name="references"/>
+    <w:bookmarkEnd w:id="55"/>
+    <w:bookmarkEnd w:id="56"/>
+    <w:bookmarkStart w:id="70" w:name="references"/>
     <w:p>
       <w:pPr>
         <w:pStyle w:val="Heading2"/>
@@ -4635,7 +4677,7 @@
       <w:r>
         <w:t xml:space="preserve"> </w:t>
       </w:r>
-      <w:hyperlink r:id="rId54">
+      <w:hyperlink r:id="rId57">
         <w:r>
           <w:rPr>
             <w:rStyle w:val="Hyperlink"/>
@@ -4675,7 +4717,7 @@
       <w:r>
         <w:t xml:space="preserve"> </w:t>
       </w:r>
-      <w:hyperlink r:id="rId55">
+      <w:hyperlink r:id="rId58">
         <w:r>
           <w:rPr>
             <w:rStyle w:val="Hyperlink"/>
@@ -4720,7 +4762,7 @@
       <w:r>
         <w:t xml:space="preserve"> </w:t>
       </w:r>
-      <w:hyperlink r:id="rId56">
+      <w:hyperlink r:id="rId59">
         <w:r>
           <w:rPr>
             <w:rStyle w:val="Hyperlink"/>
@@ -4752,7 +4794,7 @@
       <w:r>
         <w:t xml:space="preserve"> </w:t>
       </w:r>
-      <w:hyperlink r:id="rId57">
+      <w:hyperlink r:id="rId60">
         <w:r>
           <w:rPr>
             <w:rStyle w:val="Hyperlink"/>
@@ -4808,7 +4850,7 @@
       <w:r>
         <w:t xml:space="preserve"> </w:t>
       </w:r>
-      <w:hyperlink r:id="rId58">
+      <w:hyperlink r:id="rId61">
         <w:r>
           <w:rPr>
             <w:rStyle w:val="Hyperlink"/>
@@ -4840,7 +4882,7 @@
       <w:r>
         <w:t xml:space="preserve"> </w:t>
       </w:r>
-      <w:hyperlink r:id="rId59">
+      <w:hyperlink r:id="rId62">
         <w:r>
           <w:rPr>
             <w:rStyle w:val="Hyperlink"/>
@@ -4869,7 +4911,7 @@
       <w:r>
         <w:t xml:space="preserve"> </w:t>
       </w:r>
-      <w:hyperlink r:id="rId60">
+      <w:hyperlink r:id="rId63">
         <w:r>
           <w:rPr>
             <w:rStyle w:val="Hyperlink"/>
@@ -4904,7 +4946,7 @@
       <w:r>
         <w:t xml:space="preserve"> </w:t>
       </w:r>
-      <w:hyperlink r:id="rId61">
+      <w:hyperlink r:id="rId64">
         <w:r>
           <w:rPr>
             <w:rStyle w:val="Hyperlink"/>
@@ -4936,7 +4978,7 @@
       <w:r>
         <w:t xml:space="preserve"> </w:t>
       </w:r>
-      <w:hyperlink r:id="rId62">
+      <w:hyperlink r:id="rId65">
         <w:r>
           <w:rPr>
             <w:rStyle w:val="Hyperlink"/>
@@ -4968,7 +5010,7 @@
       <w:r>
         <w:t xml:space="preserve"> </w:t>
       </w:r>
-      <w:hyperlink r:id="rId63">
+      <w:hyperlink r:id="rId66">
         <w:r>
           <w:rPr>
             <w:rStyle w:val="Hyperlink"/>
@@ -5000,7 +5042,7 @@
       <w:r>
         <w:t xml:space="preserve"> </w:t>
       </w:r>
-      <w:hyperlink r:id="rId64">
+      <w:hyperlink r:id="rId67">
         <w:r>
           <w:rPr>
             <w:rStyle w:val="Hyperlink"/>
@@ -5019,7 +5061,7 @@
       <w:r>
         <w:t xml:space="preserve"> </w:t>
       </w:r>
-      <w:hyperlink r:id="rId65">
+      <w:hyperlink r:id="rId68">
         <w:r>
           <w:rPr>
             <w:rStyle w:val="Hyperlink"/>
@@ -5051,7 +5093,7 @@
       <w:r>
         <w:t xml:space="preserve"> </w:t>
       </w:r>
-      <w:hyperlink r:id="rId66">
+      <w:hyperlink r:id="rId69">
         <w:r>
           <w:rPr>
             <w:rStyle w:val="Hyperlink"/>
@@ -5067,8 +5109,8 @@
         </w:pict>
       </w:r>
     </w:p>
-    <w:bookmarkEnd w:id="67"/>
-    <w:bookmarkStart w:id="68" w:name="technical-notes"/>
+    <w:bookmarkEnd w:id="70"/>
+    <w:bookmarkStart w:id="71" w:name="technical-notes"/>
     <w:p>
       <w:pPr>
         <w:pStyle w:val="Heading2"/>
@@ -5168,8 +5210,8 @@
         <w:t xml:space="preserve">UHERO, the University of Hawaiʻi Economic Research Organization, provides objective economic analysis and data for Hawaiʻi. The views expressed are those of the authors and do not represent any state agency. Data and replication code available at [repository link].</w:t>
       </w:r>
     </w:p>
-    <w:bookmarkEnd w:id="68"/>
-    <w:bookmarkEnd w:id="69"/>
+    <w:bookmarkEnd w:id="71"/>
+    <w:bookmarkEnd w:id="72"/>
     <w:sectPr>
       <w:footnotePr>
         <w:numRestart w:val="eachSect"/>
@@ -6073,7 +6115,6 @@
     <w:link w:val="VerbatimChar"/>
     <w:pPr>
       <w:wordWrap w:val="off"/>
-      <w:shd w:val="clear" w:fill="f8f8f8"/>
     </w:pPr>
   </w:style>
   <w:style w:type="character" w:customStyle="1" w:styleId="KeywordTok">
@@ -6081,96 +6122,85 @@
     <w:basedOn w:val="VerbatimChar"/>
     <w:rPr>
       <w:b/>
-      <w:color w:val="204a87"/>
-      <w:shd w:val="clear" w:fill="f8f8f8"/>
+      <w:color w:val="007020"/>
     </w:rPr>
   </w:style>
   <w:style w:type="character" w:customStyle="1" w:styleId="DataTypeTok">
     <w:name w:val="DataTypeTok"/>
     <w:basedOn w:val="VerbatimChar"/>
     <w:rPr>
-      <w:color w:val="204a87"/>
-      <w:shd w:val="clear" w:fill="f8f8f8"/>
+      <w:color w:val="902000"/>
     </w:rPr>
   </w:style>
   <w:style w:type="character" w:customStyle="1" w:styleId="DecValTok">
     <w:name w:val="DecValTok"/>
     <w:basedOn w:val="VerbatimChar"/>
     <w:rPr>
-      <w:color w:val="0000cf"/>
-      <w:shd w:val="clear" w:fill="f8f8f8"/>
+      <w:color w:val="40a070"/>
     </w:rPr>
   </w:style>
   <w:style w:type="character" w:customStyle="1" w:styleId="BaseNTok">
     <w:name w:val="BaseNTok"/>
     <w:basedOn w:val="VerbatimChar"/>
     <w:rPr>
-      <w:color w:val="0000cf"/>
-      <w:shd w:val="clear" w:fill="f8f8f8"/>
+      <w:color w:val="40a070"/>
     </w:rPr>
   </w:style>
   <w:style w:type="character" w:customStyle="1" w:styleId="FloatTok">
     <w:name w:val="FloatTok"/>
     <w:basedOn w:val="VerbatimChar"/>
     <w:rPr>
-      <w:color w:val="0000cf"/>
-      <w:shd w:val="clear" w:fill="f8f8f8"/>
+      <w:color w:val="40a070"/>
     </w:rPr>
   </w:style>
   <w:style w:type="character" w:customStyle="1" w:styleId="ConstantTok">
     <w:name w:val="ConstantTok"/>
     <w:basedOn w:val="VerbatimChar"/>
     <w:rPr>
-      <w:color w:val="8f5902"/>
-      <w:shd w:val="clear" w:fill="f8f8f8"/>
+      <w:color w:val="880000"/>
     </w:rPr>
   </w:style>
   <w:style w:type="character" w:customStyle="1" w:styleId="CharTok">
     <w:name w:val="CharTok"/>
     <w:basedOn w:val="VerbatimChar"/>
     <w:rPr>
-      <w:color w:val="4e9a06"/>
-      <w:shd w:val="clear" w:fill="f8f8f8"/>
+      <w:color w:val="4070a0"/>
     </w:rPr>
   </w:style>
   <w:style w:type="character" w:customStyle="1" w:styleId="SpecialCharTok">
     <w:name w:val="SpecialCharTok"/>
     <w:basedOn w:val="VerbatimChar"/>
     <w:rPr>
-      <w:b/>
-      <w:color w:val="ce5c00"/>
-      <w:shd w:val="clear" w:fill="f8f8f8"/>
+      <w:color w:val="4070a0"/>
     </w:rPr>
   </w:style>
   <w:style w:type="character" w:customStyle="1" w:styleId="StringTok">
     <w:name w:val="StringTok"/>
     <w:basedOn w:val="VerbatimChar"/>
     <w:rPr>
-      <w:color w:val="4e9a06"/>
-      <w:shd w:val="clear" w:fill="f8f8f8"/>
+      <w:color w:val="4070a0"/>
     </w:rPr>
   </w:style>
   <w:style w:type="character" w:customStyle="1" w:styleId="VerbatimStringTok">
     <w:name w:val="VerbatimStringTok"/>
     <w:basedOn w:val="VerbatimChar"/>
     <w:rPr>
-      <w:color w:val="4e9a06"/>
-      <w:shd w:val="clear" w:fill="f8f8f8"/>
+      <w:color w:val="4070a0"/>
     </w:rPr>
   </w:style>
   <w:style w:type="character" w:customStyle="1" w:styleId="SpecialStringTok">
     <w:name w:val="SpecialStringTok"/>
     <w:basedOn w:val="VerbatimChar"/>
     <w:rPr>
-      <w:color w:val="4e9a06"/>
-      <w:shd w:val="clear" w:fill="f8f8f8"/>
+      <w:color w:val="bb6688"/>
     </w:rPr>
   </w:style>
   <w:style w:type="character" w:customStyle="1" w:styleId="ImportTok">
     <w:name w:val="ImportTok"/>
     <w:basedOn w:val="VerbatimChar"/>
     <w:rPr>
-      <w:shd w:val="clear" w:fill="f8f8f8"/>
+      <w:b/>
+      <w:color w:val="008000"/>
     </w:rPr>
   </w:style>
   <w:style w:type="character" w:customStyle="1" w:styleId="CommentTok">
@@ -6178,18 +6208,15 @@
     <w:basedOn w:val="VerbatimChar"/>
     <w:rPr>
       <w:i/>
-      <w:color w:val="8f5902"/>
-      <w:shd w:val="clear" w:fill="f8f8f8"/>
+      <w:color w:val="60a0b0"/>
     </w:rPr>
   </w:style>
   <w:style w:type="character" w:customStyle="1" w:styleId="DocumentationTok">
     <w:name w:val="DocumentationTok"/>
     <w:basedOn w:val="VerbatimChar"/>
     <w:rPr>
-      <w:b/>
       <w:i/>
-      <w:color w:val="8f5902"/>
-      <w:shd w:val="clear" w:fill="f8f8f8"/>
+      <w:color w:val="ba2121"/>
     </w:rPr>
   </w:style>
   <w:style w:type="character" w:customStyle="1" w:styleId="AnnotationTok">
@@ -6198,8 +6225,7 @@
     <w:rPr>
       <w:b/>
       <w:i/>
-      <w:color w:val="8f5902"/>
-      <w:shd w:val="clear" w:fill="f8f8f8"/>
+      <w:color w:val="60a0b0"/>
     </w:rPr>
   </w:style>
   <w:style w:type="character" w:customStyle="1" w:styleId="CommentVarTok">
@@ -6208,33 +6234,28 @@
     <w:rPr>
       <w:b/>
       <w:i/>
-      <w:color w:val="8f5902"/>
-      <w:shd w:val="clear" w:fill="f8f8f8"/>
+      <w:color w:val="60a0b0"/>
     </w:rPr>
   </w:style>
   <w:style w:type="character" w:customStyle="1" w:styleId="OtherTok">
     <w:name w:val="OtherTok"/>
     <w:basedOn w:val="VerbatimChar"/>
     <w:rPr>
-      <w:color w:val="8f5902"/>
-      <w:shd w:val="clear" w:fill="f8f8f8"/>
+      <w:color w:val="007020"/>
     </w:rPr>
   </w:style>
   <w:style w:type="character" w:customStyle="1" w:styleId="FunctionTok">
     <w:name w:val="FunctionTok"/>
     <w:basedOn w:val="VerbatimChar"/>
     <w:rPr>
-      <w:b/>
-      <w:color w:val="204a87"/>
-      <w:shd w:val="clear" w:fill="f8f8f8"/>
+      <w:color w:val="06287e"/>
     </w:rPr>
   </w:style>
   <w:style w:type="character" w:customStyle="1" w:styleId="VariableTok">
     <w:name w:val="VariableTok"/>
     <w:basedOn w:val="VerbatimChar"/>
     <w:rPr>
-      <w:color w:val="000000"/>
-      <w:shd w:val="clear" w:fill="f8f8f8"/>
+      <w:color w:val="19177c"/>
     </w:rPr>
   </w:style>
   <w:style w:type="character" w:customStyle="1" w:styleId="ControlFlowTok">
@@ -6242,56 +6263,46 @@
     <w:basedOn w:val="VerbatimChar"/>
     <w:rPr>
       <w:b/>
-      <w:color w:val="204a87"/>
-      <w:shd w:val="clear" w:fill="f8f8f8"/>
+      <w:color w:val="007020"/>
     </w:rPr>
   </w:style>
   <w:style w:type="character" w:customStyle="1" w:styleId="OperatorTok">
     <w:name w:val="OperatorTok"/>
     <w:basedOn w:val="VerbatimChar"/>
     <w:rPr>
-      <w:b/>
-      <w:color w:val="ce5c00"/>
-      <w:shd w:val="clear" w:fill="f8f8f8"/>
+      <w:color w:val="666666"/>
     </w:rPr>
   </w:style>
   <w:style w:type="character" w:customStyle="1" w:styleId="BuiltInTok">
     <w:name w:val="BuiltInTok"/>
     <w:basedOn w:val="VerbatimChar"/>
     <w:rPr>
-      <w:shd w:val="clear" w:fill="f8f8f8"/>
+      <w:color w:val="008000"/>
     </w:rPr>
   </w:style>
   <w:style w:type="character" w:customStyle="1" w:styleId="ExtensionTok">
     <w:name w:val="ExtensionTok"/>
     <w:basedOn w:val="VerbatimChar"/>
-    <w:rPr>
-      <w:shd w:val="clear" w:fill="f8f8f8"/>
-    </w:rPr>
+    <w:rPr/>
   </w:style>
   <w:style w:type="character" w:customStyle="1" w:styleId="PreprocessorTok">
     <w:name w:val="PreprocessorTok"/>
     <w:basedOn w:val="VerbatimChar"/>
     <w:rPr>
-      <w:i/>
-      <w:color w:val="8f5902"/>
-      <w:shd w:val="clear" w:fill="f8f8f8"/>
+      <w:color w:val="bc7a00"/>
     </w:rPr>
   </w:style>
   <w:style w:type="character" w:customStyle="1" w:styleId="AttributeTok">
     <w:name w:val="AttributeTok"/>
     <w:basedOn w:val="VerbatimChar"/>
     <w:rPr>
-      <w:color w:val="204a87"/>
-      <w:shd w:val="clear" w:fill="f8f8f8"/>
+      <w:color w:val="7d9029"/>
     </w:rPr>
   </w:style>
   <w:style w:type="character" w:customStyle="1" w:styleId="RegionMarkerTok">
     <w:name w:val="RegionMarkerTok"/>
     <w:basedOn w:val="VerbatimChar"/>
-    <w:rPr>
-      <w:shd w:val="clear" w:fill="f8f8f8"/>
-    </w:rPr>
+    <w:rPr/>
   </w:style>
   <w:style w:type="character" w:customStyle="1" w:styleId="InformationTok">
     <w:name w:val="InformationTok"/>
@@ -6299,8 +6310,7 @@
     <w:rPr>
       <w:b/>
       <w:i/>
-      <w:color w:val="8f5902"/>
-      <w:shd w:val="clear" w:fill="f8f8f8"/>
+      <w:color w:val="60a0b0"/>
     </w:rPr>
   </w:style>
   <w:style w:type="character" w:customStyle="1" w:styleId="WarningTok">
@@ -6309,16 +6319,15 @@
     <w:rPr>
       <w:b/>
       <w:i/>
-      <w:color w:val="8f5902"/>
-      <w:shd w:val="clear" w:fill="f8f8f8"/>
+      <w:color w:val="60a0b0"/>
     </w:rPr>
   </w:style>
   <w:style w:type="character" w:customStyle="1" w:styleId="AlertTok">
     <w:name w:val="AlertTok"/>
     <w:basedOn w:val="VerbatimChar"/>
     <w:rPr>
-      <w:color w:val="ef2929"/>
-      <w:shd w:val="clear" w:fill="f8f8f8"/>
+      <w:b/>
+      <w:color w:val="ff0000"/>
     </w:rPr>
   </w:style>
   <w:style w:type="character" w:customStyle="1" w:styleId="ErrorTok">
@@ -6326,16 +6335,13 @@
     <w:basedOn w:val="VerbatimChar"/>
     <w:rPr>
       <w:b/>
-      <w:color w:val="a40000"/>
-      <w:shd w:val="clear" w:fill="f8f8f8"/>
+      <w:color w:val="ff0000"/>
     </w:rPr>
   </w:style>
   <w:style w:type="character" w:customStyle="1" w:styleId="NormalTok">
     <w:name w:val="NormalTok"/>
     <w:basedOn w:val="VerbatimChar"/>
-    <w:rPr>
-      <w:shd w:val="clear" w:fill="f8f8f8"/>
-    </w:rPr>
+    <w:rPr/>
   </w:style>
 </w:styles>
 </file>

</xml_diff>